<commit_message>
Stage 8 review fixes: HO-012
</commit_message>
<xml_diff>
--- a/output/archive/Tarnovell_Group/Integration/Programme/2024/One_Group_Many_Practices_Charter_v1.docx
+++ b/output/archive/Tarnovell_Group/Integration/Programme/2024/One_Group_Many_Practices_Charter_v1.docx
@@ -31,6 +31,11 @@
     </w:p>
     <w:p>
       <w:r>
+        <w:t>Tarnovell Bioscience Group</w:t>
+      </w:r>
+    </w:p>
+    <w:p>
+      <w:r>
         <w:t>Report no. TG-HO-INT-2024-001</w:t>
       </w:r>
     </w:p>
@@ -50,7 +55,7 @@
     </w:p>
     <w:p>
       <w:r>
-        <w:t>This charter sets out how the group will converge its shared processes while the firms keep doing their own science. It replaces the informal arrangements that carried the Formulation acquisition through its first quarter and gives each workstream a named owner, a status line and a route for decisions that cross firm boundaries.</w:t>
+        <w:t>This charter sets out how the group will converge its shared processes while the firms keep doing their own science. It replaces the informal arrangements that carried the Formulation acquisition through its initial onboarding and gives each workstream a named owner, a status line and a route for decisions that cross firm boundaries.</w:t>
       </w:r>
     </w:p>
     <w:p>
@@ -92,7 +97,7 @@
     </w:p>
     <w:p>
       <w:r>
-        <w:t>Each workstream has one accountable owner. The owner reports status to the programme office each fortnight and brings any cross-firm trade-off to the steering group, not to the firm concerned.</w:t>
+        <w:t>Each workstream has one accountable owner. The owner reports status to the programme office each fortnight and brings any cross-firm trade-off to the steering group with the affected firms consulted.</w:t>
       </w:r>
     </w:p>
     <w:p>
@@ -684,7 +689,7 @@
     </w:p>
     <w:p>
       <w:r>
-        <w:t>Each firm keeps its own lead scientist, its own study director sign-off and its own quality system until the steering group decides otherwise in writing. Yasmin Farhat remains the group quality owner for the common procedures, but she does not sign off study outputs on behalf of a firm.</w:t>
+        <w:t>Each firm keeps its own lead scientist, its own study director sign-off and its own quality system. Shared-process decisions do not transfer local scientific accountability. Yasmin Farhat remains the group quality owner for the common procedures, but she does not sign off study outputs on behalf of a firm.</w:t>
       </w:r>
     </w:p>
     <w:p>
@@ -703,12 +708,12 @@
     </w:p>
     <w:p>
       <w:r>
-        <w:t>The charter is reviewed at each steering group meeting and at the end of each workstream milestone. Changes are made by the Integration Director and issued as a new version. The next scheduled review is in July 2024, after the F brand migration sign-off.</w:t>
+        <w:t>The charter is reviewed at each steering group meeting and at the end of each workstream milestone. Changes are made by the Integration Director and issued as a new version. The next scheduled review is in July 2024, ahead of the provisional August target for F brand migration sign-off.</w:t>
       </w:r>
     </w:p>
     <w:p>
       <w:r>
-        <w:t>The workstream table in section 3 is updated fortnightly by the owners and does not need a charter version change.</w:t>
+        <w:t>Owners maintain fortnightly status updates in the programme tracker. The approved workstream ownership and April status snapshot in this charter change only through a new controlled version.</w:t>
       </w:r>
     </w:p>
     <w:p/>

</xml_diff>